<commit_message>
feat(cad): video Modul 12 versi klik GUI + teks praktik dan Gambar 7 sesuai rekaman
Video praktik terbimbing Modul 12 (audit satu dokumen, 17:10) direkam dengan klik
GUI asli: Number of decimals 3, Cube A/B dan Intersection 3.150 → 0 mm³ (distToShape
0), fit ⌀12 H7/g6 ekstrem lewat Clarify Selection + Tools → Measure (17,500 µm,
c maks 0,035), rumah dengan Centered Rectangle (dinding 4, dasar 10, 79.680 mm³),
Slot dan Pocket Through all (e = 19), lengan pada θ* = 9,7275° (jarak bebas 28,979),
Check Geometry 0 invalid, Ctrl+S.

Teks Bagian 09 Modul 12 mengikuti rekaman (nilai tiap langkah, Measure disimpan,
isian ketiga Slot = jari-jari, Horizontal Constraint lewat daftar Elements, "Bad base
feature"); tabel gejala bertambah lima baris. Gambar 7: cincin dari bidang XY sejajar
pangkal poros, Pocket berpusat, dinding Cube 10 × 100 × 20, hasil Check Geometry.
Word/PDF Modul 12 dan PDF gabungan CAD dibangun ulang.

Co-Authored-By: Claude Opus 5.5 <noreply@anthropic.com>
</commit_message>
<xml_diff>
--- a/Pemodelan-Computer-Aided-Design/Modul-Word/Modul-12-Identifikasi-Masalah-Desain-dan-Solusi-Optimasi.docx
+++ b/Pemodelan-Computer-Aided-Design/Modul-Word/Modul-12-Identifikasi-Masalah-Desain-dan-Solusi-Optimasi.docx
@@ -13774,7 +13774,7 @@
           <w:i w:val="0"/>
           <w:sz w:val="20"/>
         </w:rPr>
-        <w:t>Gambar 7 — Gambar kerja audit satu dokumen: tabrakan, fit, dinding tipis, jarak tepi, dan jarak bebas gerak. Satuan mm; volume dalam mm³. Nomor 1–5 mengikuti langkah: (1) Box A 60 × 45 × 28 dan Box B 50 × 45 × 28 menumpang δ = 2,5 sehingga Common = 3.150,00 mm³, lalu nol setelah B digeser ke ujung A; (2) cincin berlubang ⌀12,0180 (batas maksimum ⌀12 H7) dan poros ⌀11,9830 (batas minimum g6) sesumbu, celahnya digambar diperbesar; (3) rumah 80 × 60 × 40 dengan Pocket 72 × 52 sedalam 30; (4) pelat 120 × 50 × 6 dengan slot berjarak pusat 64 dan lebar 18, serta jarak tepi e; (5) lengan 70 × 24 × 8 diputar θ</w:t>
+        <w:t>Gambar 7 — Gambar kerja audit satu dokumen: tabrakan, fit, dinding tipis, jarak tepi, dan jarak bebas gerak. Satuan mm; volume dalam mm³. Nomor 1–5 mengikuti langkah: (1) Box A 60 × 45 × 28 dan Box B 50 × 45 × 28 menumpang δ = 2,5 sehingga Common = 3.150,00 mm³, lalu nol setelah B digeser ke ujung A; (2) cincin berlubang ⌀12,0180 (batas maksimum ⌀12 H7) dan poros ⌀11,9830 (batas minimum g6) sesumbu dari bidang XY, celahnya digambar diperbesar (diameter luar cincin 24 tidak memengaruhi fit); (3) rumah 80 × 60 × 40 dengan Pocket 72 × 52 sedalam 30; (4) pelat 120 × 50 × 6 dengan slot berjarak pusat 64 dan lebar 18, serta jarak tepi e; (5) lengan 70 × 24 × 8 diputar θ</w:t>
       </w:r>
       <w:r>
         <w:rPr>
@@ -13793,7 +13793,7 @@
           <w:i w:val="0"/>
           <w:sz w:val="20"/>
         </w:rPr>
-        <w:t xml:space="preserve"> = 9,73° di depan dinding pada x = 100. Diameter luar dan letak aksial cincin, serta ukuran Part Box dinding, tidak ditetapkan langkah, jadi digambar tanpa ukuran.</w:t>
+        <w:t xml:space="preserve"> = 9,73° di depan dinding (Cube 10 × 100 × 20) yang muka dalamnya pada x = 100. Setiap jarak diukur dengan Tools → Measure pada 3 desimal dan tersimpan sebagai objek Distance di grup Measurements.</w:t>
       </w:r>
     </w:p>
     <w:p>
@@ -13826,7 +13826,25 @@
           <w:i w:val="0"/>
           <w:sz w:val="22"/>
         </w:rPr>
-        <w:t>Buat dokumen baru. Part → Primitives → Box A berukuran 60 × 45 × 28 mm di titik asal, lalu Box B berukuran 50 × 45 × 28 mm dengan Placement Position x = 57,5 mm sehingga B menumpang A sejauh δ = 2,5 mm.</w:t>
+        <w:t xml:space="preserve">Buat dokumen baru. Edit → Preferences → General: </w:t>
+      </w:r>
+      <w:r>
+        <w:rPr>
+          <w:rFonts w:ascii="Arial" w:hAnsi="Arial" w:eastAsia="Arial" w:cs="Arial"/>
+          <w:b w:val="0"/>
+          <w:i/>
+          <w:sz w:val="22"/>
+        </w:rPr>
+        <w:t>Number of decimals</w:t>
+      </w:r>
+      <w:r>
+        <w:rPr>
+          <w:rFonts w:ascii="Arial" w:hAnsi="Arial" w:eastAsia="Arial" w:cs="Arial"/>
+          <w:b w:val="0"/>
+          <w:i w:val="0"/>
+          <w:sz w:val="22"/>
+        </w:rPr>
+        <w:t xml:space="preserve"> = 3 → OK, agar ukuran batas dan celah terbaca utuh. Workbench Part: Part → Primitives → Cube, F2 ganti nama “A”, tab Data: Length 60, Width 45, Height 28. Cube kedua “B”: 50 × 45 × 28, Placement → Position → x = 57,5 (ketik koma), sehingga B menumpang A sejauh δ = 2,5 mm.</w:t>
       </w:r>
     </w:p>
     <w:p>
@@ -13859,7 +13877,7 @@
           <w:i w:val="0"/>
           <w:sz w:val="22"/>
         </w:rPr>
-        <w:t>Pilih A dan B → Part → Boolean → Common. Baca Common.Shape.Volume (atau Std Measure Volume): 3.150,00 mm³, sama dengan δ·b·h. Catat sebagai nilai “sebelum”, lalu batalkan Boolean dengan Ctrl+Z.</w:t>
+        <w:t>Pilih A lalu Ctrl+klik B → Part → Boolean → Intersection. Konsol: round(App.ActiveDocument.Common.Shape.Volume, 2) = 3.150,00 mm³, sama dengan δ·b·h. Catat sebagai nilai “sebelum”, lalu klik ruang kosong dan Ctrl+Z untuk membatalkan Common.</w:t>
       </w:r>
     </w:p>
     <w:p>
@@ -13892,7 +13910,7 @@
           <w:i w:val="0"/>
           <w:sz w:val="22"/>
         </w:rPr>
-        <w:t>Ubah Placement Position x milik B menjadi tepat di ujung A sehingga keduanya hanya bersinggungan. Ulangi Common: volumenya harus 0 mm³, dan A.distToShape(B)[0] bernilai 0 karena bersentuhan. Beri jarak rakit kecil bila memang diinginkan celah.</w:t>
+        <w:t>Pilih B, Position x = 60 (tepat di ujung A). Ulangi Intersection: volume Common 0 mm³; konsol A, B = [App.ActiveDocument.getObjectsByLabel(n)[0].Shape for n in ('A', 'B')] lalu A.distToShape(B)[0] = 0 karena bersentuhan. Ctrl+Z, sembunyikan A dan B (Space), lalu klik ruang kosong: New Body yang dijalankan saat objek masih terpilih ditolak (“Bad base feature”).</w:t>
       </w:r>
     </w:p>
     <w:p>
@@ -13925,7 +13943,25 @@
           <w:i w:val="0"/>
           <w:sz w:val="22"/>
         </w:rPr>
-        <w:t>Body baru: cincin (Sketch dua lingkaran sepusat, lubang pada ukuran maksimum ⌀12,0180) di-Pad 10 mm, dan poros pada ukuran minimum ⌀11,9830 di-Pad 30 mm, sesumbu. Std Measure Distance antara dua muka silinder memberi celah radial 0,0175 mm; kalikan dua menjadi c</w:t>
+        <w:t xml:space="preserve">Part Design → New Body “Cincin”: Sketch XY-plane, Circle From Center pusat 0, 0 diameter 24, lalu lingkaran kedua diameter 12,018 (ukuran maksimum lubang) → Pad 10. New Body “Poros”: lingkaran 0, 0 diameter 11,983 (ukuran minimum poros) → Pad 30. Muka lubang cincin tertutup poros: klik kanan di atasnya → Clarify Selection → Face → Pad (Face…), lalu Ctrl+klik muka poros di atas cincin → Tools → </w:t>
+      </w:r>
+      <w:r>
+        <w:rPr>
+          <w:rFonts w:ascii="Arial" w:hAnsi="Arial" w:eastAsia="Arial" w:cs="Arial"/>
+          <w:b/>
+          <w:i w:val="0"/>
+          <w:sz w:val="22"/>
+        </w:rPr>
+        <w:t>Measure</w:t>
+      </w:r>
+      <w:r>
+        <w:rPr>
+          <w:rFonts w:ascii="Arial" w:hAnsi="Arial" w:eastAsia="Arial" w:cs="Arial"/>
+          <w:b w:val="0"/>
+          <w:i w:val="0"/>
+          <w:sz w:val="22"/>
+        </w:rPr>
+        <w:t>: 17,500 µm = 0,0175 mm (celah radial) → Save → Close. c</w:t>
       </w:r>
       <w:r>
         <w:rPr>
@@ -13944,7 +13980,7 @@
           <w:i w:val="0"/>
           <w:sz w:val="22"/>
         </w:rPr>
-        <w:t xml:space="preserve"> = 0,0350 mm.</w:t>
+        <w:t xml:space="preserve"> = 2 × 0,0175 = 0,035 mm.</w:t>
       </w:r>
     </w:p>
     <w:p>
@@ -13977,7 +14013,25 @@
           <w:i w:val="0"/>
           <w:sz w:val="22"/>
         </w:rPr>
-        <w:t>Body baru: Sketch 80 × 60 mm → Pad 40 mm. Pada muka atas, Sketch 72 × 52 mm yang dipusatkan dengan konstrain Symmetric → Pocket Dimension 30 mm. Periksa tebal dinding 4,0 mm dan dasar 10,0 mm dengan Std Measure; volume solid harus 79.680,00 mm³.</w:t>
+        <w:t xml:space="preserve">New Body “Rumah”: Sketch XY, </w:t>
+      </w:r>
+      <w:r>
+        <w:rPr>
+          <w:rFonts w:ascii="Arial" w:hAnsi="Arial" w:eastAsia="Arial" w:cs="Arial"/>
+          <w:b/>
+          <w:i w:val="0"/>
+          <w:sz w:val="22"/>
+        </w:rPr>
+        <w:t>Centered Rectangle</w:t>
+      </w:r>
+      <w:r>
+        <w:rPr>
+          <w:rFonts w:ascii="Arial" w:hAnsi="Arial" w:eastAsia="Arial" w:cs="Arial"/>
+          <w:b w:val="0"/>
+          <w:i w:val="0"/>
+          <w:sz w:val="22"/>
+        </w:rPr>
+        <w:t xml:space="preserve"> pusat 0, 0 ukuran 80 × 60 → Pad 40. Klik muka atas → New Sketch → Centered Rectangle pusat 0, 0 ukuran 72 × 52 (pusat sama: dinding rata) → Pocket 30. Konsol: volume 79.680,00 mm³. Tekan 2, klik tepi atas luar lalu Ctrl+klik tepi atas dalam satu dinding → Measure 4,000 mm; klik lantai Pocket, tekan 5, Ctrl+klik muka bawah → Measure 10,000 mm.</w:t>
       </w:r>
     </w:p>
     <w:p>
@@ -14010,7 +14064,43 @@
           <w:i w:val="0"/>
           <w:sz w:val="22"/>
         </w:rPr>
-        <w:t>Body baru: pelat 120 × 50 × 6 mm simetris terhadap origin → Pad. Pada muka atas gambar satu slot obround (alat Slot) dengan jarak pusat-ke-pusat 64 mm dan lebar 18 mm → Pocket Through all. Std Measure dari ujung busur ke tepi pendek pelat memberi e = 19,000 mm, di atas batas 1,5·t = 9,0 mm.</w:t>
+        <w:t xml:space="preserve">New Body “Pelat”: Centered Rectangle 120 × 50 → Pad 6. Klik muka atas → New Sketch → </w:t>
+      </w:r>
+      <w:r>
+        <w:rPr>
+          <w:rFonts w:ascii="Arial" w:hAnsi="Arial" w:eastAsia="Arial" w:cs="Arial"/>
+          <w:b/>
+          <w:i w:val="0"/>
+          <w:sz w:val="22"/>
+        </w:rPr>
+        <w:t>Slot</w:t>
+      </w:r>
+      <w:r>
+        <w:rPr>
+          <w:rFonts w:ascii="Arial" w:hAnsi="Arial" w:eastAsia="Arial" w:cs="Arial"/>
+          <w:b w:val="0"/>
+          <w:i w:val="0"/>
+          <w:sz w:val="22"/>
+        </w:rPr>
+        <w:t xml:space="preserve">: titik awal −32, 0; panjang 64, sudut 0; isian ketiga adalah jari-jari, ketik 9 (lebar 18). Sudut 0 tidak menjadi konstrain: pilih garis slot di daftar Elements → Horizontal Constraint (Fully constrained) → Pocket </w:t>
+      </w:r>
+      <w:r>
+        <w:rPr>
+          <w:rFonts w:ascii="Arial" w:hAnsi="Arial" w:eastAsia="Arial" w:cs="Arial"/>
+          <w:b w:val="0"/>
+          <w:i/>
+          <w:sz w:val="22"/>
+        </w:rPr>
+        <w:t>Through all</w:t>
+      </w:r>
+      <w:r>
+        <w:rPr>
+          <w:rFonts w:ascii="Arial" w:hAnsi="Arial" w:eastAsia="Arial" w:cs="Arial"/>
+          <w:b w:val="0"/>
+          <w:i w:val="0"/>
+          <w:sz w:val="22"/>
+        </w:rPr>
+        <w:t>. Tekan 2, klik tepi busur ujung slot lalu Ctrl+klik tepi pendek pelat → Measure e = 19,000 mm, di atas batas 1,5·t = 9,0 mm.</w:t>
       </w:r>
     </w:p>
     <w:p>
@@ -14043,7 +14133,7 @@
           <w:i w:val="0"/>
           <w:sz w:val="22"/>
         </w:rPr>
-        <w:t>Body lengan 70 × 24 × 8 mm dengan sumbu putar Z di titik asal, dan dinding Part Box yang muka dalamnya di x = 100 mm. Putar Placement Angle ke θ</w:t>
+        <w:t>New Body “Lengan”: Rectangle sudut 0, −12 ukuran 70 × 24 → Pad 8 (sumbu putar Z di titik asal). Workbench Part: Cube “Dinding” 10 × 100 × 20 di Position x = 100, y = −50 (muka dalam di x = 100). Pilih Body Lengan → Placement → Angle = θ</w:t>
       </w:r>
       <w:r>
         <w:rPr>
@@ -14062,7 +14152,25 @@
           <w:i w:val="0"/>
           <w:sz w:val="22"/>
         </w:rPr>
-        <w:t xml:space="preserve"> = 9,73° lalu Std Measure Distance sudut lengan → muka dinding: 28,979 mm. Jalankan Part → Check Geometry pada semua Body (harus bersih), lalu Ctrl+S ke Latihan12_NIM.FCStd.</w:t>
+        <w:t xml:space="preserve"> = 9,7275° (= 9,73°). Tekan 2, klik sudut lengan terjauh (vertex), tekan 6, Ctrl+klik muka dalam dinding → Measure 28,979 mm. Pilih kedelapan solid → Part → </w:t>
+      </w:r>
+      <w:r>
+        <w:rPr>
+          <w:rFonts w:ascii="Arial" w:hAnsi="Arial" w:eastAsia="Arial" w:cs="Arial"/>
+          <w:b/>
+          <w:i w:val="0"/>
+          <w:sz w:val="22"/>
+        </w:rPr>
+        <w:t>Check Geometry</w:t>
+      </w:r>
+      <w:r>
+        <w:rPr>
+          <w:rFonts w:ascii="Arial" w:hAnsi="Arial" w:eastAsia="Arial" w:cs="Arial"/>
+          <w:b w:val="0"/>
+          <w:i w:val="0"/>
+          <w:sz w:val="22"/>
+        </w:rPr>
+        <w:t xml:space="preserve"> → Run check: 0 invalid shapes. Ctrl+S ke Latihan12_NIM.FCStd.</w:t>
       </w:r>
     </w:p>
     <w:p>
@@ -14171,7 +14279,7 @@
                 <w:i w:val="0"/>
                 <w:sz w:val="18"/>
               </w:rPr>
-              <w:t>Common menghasilkan objek kosong padahal jelas menumpang</w:t>
+              <w:t>New Body menolak dengan pesan “Bad base feature”</w:t>
             </w:r>
           </w:p>
         </w:tc>
@@ -14190,7 +14298,7 @@
                 <w:i w:val="0"/>
                 <w:sz w:val="18"/>
               </w:rPr>
-              <w:t>Yang dipilih objek induk yang sudah termakan Boolean sebelumnya, atau salah satu bukan solid</w:t>
+              <w:t>Masih ada objek terpilih saat New Body (dijadikan base feature)</w:t>
             </w:r>
           </w:p>
         </w:tc>
@@ -14209,7 +14317,7 @@
                 <w:i w:val="0"/>
                 <w:sz w:val="18"/>
               </w:rPr>
-              <w:t>Batalkan Boolean terdahulu; periksa Check Geometry kedua bentuk</w:t>
+              <w:t>Klik ruang kosong dulu, lalu Part Design → New Body</w:t>
             </w:r>
           </w:p>
         </w:tc>
@@ -14230,7 +14338,7 @@
                 <w:i w:val="0"/>
                 <w:sz w:val="18"/>
               </w:rPr>
-              <w:t>Volume Common jauh dari δ·b·h</w:t>
+              <w:t>Measure menampilkan 0,02 mm untuk celah 0,0175 mm</w:t>
             </w:r>
           </w:p>
         </w:tc>
@@ -14249,7 +14357,7 @@
                 <w:i w:val="0"/>
                 <w:sz w:val="18"/>
               </w:rPr>
-              <w:t>Placement B juga bergeser arah Y atau Z, sehingga penampang bersama mengecil</w:t>
+              <w:t>Tampilan bawaan 2 desimal</w:t>
             </w:r>
           </w:p>
         </w:tc>
@@ -14268,7 +14376,7 @@
                 <w:i w:val="0"/>
                 <w:sz w:val="18"/>
               </w:rPr>
-              <w:t>Nolkan y dan z pada Placement Position; ukur ulang</w:t>
+              <w:t>Edit → Preferences → General → Number of decimals = 3</w:t>
             </w:r>
           </w:p>
         </w:tc>
@@ -14289,7 +14397,7 @@
                 <w:i w:val="0"/>
                 <w:sz w:val="18"/>
               </w:rPr>
-              <w:t>Std Measure Distance memberi 0 padahal tampak ada celah</w:t>
+              <w:t>Muka lubang cincin tidak bisa diklik</w:t>
             </w:r>
           </w:p>
         </w:tc>
@@ -14308,7 +14416,7 @@
                 <w:i w:val="0"/>
                 <w:sz w:val="18"/>
               </w:rPr>
-              <w:t>Yang terpilih muka yang bersinggungan, bukan pasangan muka yang dimaksud</w:t>
+              <w:t>Tertutup muka poros yang lebih dekat ke kamera</w:t>
             </w:r>
           </w:p>
         </w:tc>
@@ -14327,7 +14435,7 @@
                 <w:i w:val="0"/>
                 <w:sz w:val="18"/>
               </w:rPr>
-              <w:t>Perbesar tampilan, pilih muka lewat pohon atau tekan Space untuk menyembunyikan komponen penghalang</w:t>
+              <w:t>Klik kanan → Clarify Selection → Face → Pad (Face…), lalu Ctrl+klik muka kedua</w:t>
             </w:r>
           </w:p>
         </w:tc>
@@ -14348,7 +14456,7 @@
                 <w:i w:val="0"/>
                 <w:sz w:val="18"/>
               </w:rPr>
-              <w:t>Kelonggaran terbaca setengah dari perkiraan</w:t>
+              <w:t>Sketsa slot tetap under-constrained</w:t>
             </w:r>
           </w:p>
         </w:tc>
@@ -14367,7 +14475,7 @@
                 <w:i w:val="0"/>
                 <w:sz w:val="18"/>
               </w:rPr>
-              <w:t>Yang diukur celah radial, sedangkan yang diminta kelonggaran diametral</w:t>
+              <w:t>Sudut 0° pada on-view parameters tidak menjadi konstrain</w:t>
             </w:r>
           </w:p>
         </w:tc>
@@ -14386,26 +14494,7 @@
                 <w:i w:val="0"/>
                 <w:sz w:val="18"/>
               </w:rPr>
-              <w:t>Kalikan dua: c</w:t>
-            </w:r>
-            <w:r>
-              <w:rPr>
-                <w:rFonts w:ascii="Arial" w:hAnsi="Arial" w:eastAsia="Arial" w:cs="Arial"/>
-                <w:b w:val="0"/>
-                <w:i w:val="0"/>
-                <w:sz w:val="18"/>
-                <w:vertAlign w:val="subscript"/>
-              </w:rPr>
-              <w:t>diametral</w:t>
-            </w:r>
-            <w:r>
-              <w:rPr>
-                <w:rFonts w:ascii="Arial" w:hAnsi="Arial" w:eastAsia="Arial" w:cs="Arial"/>
-                <w:b w:val="0"/>
-                <w:i w:val="0"/>
-                <w:sz w:val="18"/>
-              </w:rPr>
-              <w:t xml:space="preserve"> = 2 × celah radial</w:t>
+              <w:t>Pilih garis slot di daftar Elements → Horizontal Constraint</w:t>
             </w:r>
           </w:p>
         </w:tc>
@@ -14426,6 +14515,320 @@
                 <w:i w:val="0"/>
                 <w:sz w:val="18"/>
               </w:rPr>
+              <w:t>Slot dua kali lebih lebar</w:t>
+            </w:r>
+          </w:p>
+        </w:tc>
+        <w:tc>
+          <w:tcPr>
+            <w:tcW w:type="dxa" w:w="2929"/>
+          </w:tcPr>
+          <w:p>
+            <w:pPr>
+              <w:spacing w:after="0"/>
+            </w:pPr>
+            <w:r>
+              <w:rPr>
+                <w:rFonts w:ascii="Arial" w:hAnsi="Arial" w:eastAsia="Arial" w:cs="Arial"/>
+                <w:b w:val="0"/>
+                <w:i w:val="0"/>
+                <w:sz w:val="18"/>
+              </w:rPr>
+              <w:t>Isian ketiga alat Slot adalah jari-jari, bukan lebar</w:t>
+            </w:r>
+          </w:p>
+        </w:tc>
+        <w:tc>
+          <w:tcPr>
+            <w:tcW w:type="dxa" w:w="2929"/>
+          </w:tcPr>
+          <w:p>
+            <w:pPr>
+              <w:spacing w:after="0"/>
+            </w:pPr>
+            <w:r>
+              <w:rPr>
+                <w:rFonts w:ascii="Arial" w:hAnsi="Arial" w:eastAsia="Arial" w:cs="Arial"/>
+                <w:b w:val="0"/>
+                <w:i w:val="0"/>
+                <w:sz w:val="18"/>
+              </w:rPr>
+              <w:t>Ketik setengah lebar (9 untuk lebar 18)</w:t>
+            </w:r>
+          </w:p>
+        </w:tc>
+      </w:tr>
+      <w:tr>
+        <w:tc>
+          <w:tcPr>
+            <w:tcW w:type="dxa" w:w="2929"/>
+          </w:tcPr>
+          <w:p>
+            <w:pPr>
+              <w:spacing w:after="0"/>
+            </w:pPr>
+            <w:r>
+              <w:rPr>
+                <w:rFonts w:ascii="Arial" w:hAnsi="Arial" w:eastAsia="Arial" w:cs="Arial"/>
+                <w:b w:val="0"/>
+                <w:i w:val="0"/>
+                <w:sz w:val="18"/>
+              </w:rPr>
+              <w:t>Common menghasilkan objek kosong padahal jelas menumpang</w:t>
+            </w:r>
+          </w:p>
+        </w:tc>
+        <w:tc>
+          <w:tcPr>
+            <w:tcW w:type="dxa" w:w="2929"/>
+          </w:tcPr>
+          <w:p>
+            <w:pPr>
+              <w:spacing w:after="0"/>
+            </w:pPr>
+            <w:r>
+              <w:rPr>
+                <w:rFonts w:ascii="Arial" w:hAnsi="Arial" w:eastAsia="Arial" w:cs="Arial"/>
+                <w:b w:val="0"/>
+                <w:i w:val="0"/>
+                <w:sz w:val="18"/>
+              </w:rPr>
+              <w:t>Yang dipilih objek induk yang sudah termakan Boolean sebelumnya, atau salah satu bukan solid</w:t>
+            </w:r>
+          </w:p>
+        </w:tc>
+        <w:tc>
+          <w:tcPr>
+            <w:tcW w:type="dxa" w:w="2929"/>
+          </w:tcPr>
+          <w:p>
+            <w:pPr>
+              <w:spacing w:after="0"/>
+            </w:pPr>
+            <w:r>
+              <w:rPr>
+                <w:rFonts w:ascii="Arial" w:hAnsi="Arial" w:eastAsia="Arial" w:cs="Arial"/>
+                <w:b w:val="0"/>
+                <w:i w:val="0"/>
+                <w:sz w:val="18"/>
+              </w:rPr>
+              <w:t>Batalkan Boolean terdahulu; periksa Check Geometry kedua bentuk</w:t>
+            </w:r>
+          </w:p>
+        </w:tc>
+      </w:tr>
+      <w:tr>
+        <w:tc>
+          <w:tcPr>
+            <w:tcW w:type="dxa" w:w="2929"/>
+          </w:tcPr>
+          <w:p>
+            <w:pPr>
+              <w:spacing w:after="0"/>
+            </w:pPr>
+            <w:r>
+              <w:rPr>
+                <w:rFonts w:ascii="Arial" w:hAnsi="Arial" w:eastAsia="Arial" w:cs="Arial"/>
+                <w:b w:val="0"/>
+                <w:i w:val="0"/>
+                <w:sz w:val="18"/>
+              </w:rPr>
+              <w:t>Volume Common jauh dari δ·b·h</w:t>
+            </w:r>
+          </w:p>
+        </w:tc>
+        <w:tc>
+          <w:tcPr>
+            <w:tcW w:type="dxa" w:w="2929"/>
+          </w:tcPr>
+          <w:p>
+            <w:pPr>
+              <w:spacing w:after="0"/>
+            </w:pPr>
+            <w:r>
+              <w:rPr>
+                <w:rFonts w:ascii="Arial" w:hAnsi="Arial" w:eastAsia="Arial" w:cs="Arial"/>
+                <w:b w:val="0"/>
+                <w:i w:val="0"/>
+                <w:sz w:val="18"/>
+              </w:rPr>
+              <w:t>Placement B juga bergeser arah Y atau Z, sehingga penampang bersama mengecil</w:t>
+            </w:r>
+          </w:p>
+        </w:tc>
+        <w:tc>
+          <w:tcPr>
+            <w:tcW w:type="dxa" w:w="2929"/>
+          </w:tcPr>
+          <w:p>
+            <w:pPr>
+              <w:spacing w:after="0"/>
+            </w:pPr>
+            <w:r>
+              <w:rPr>
+                <w:rFonts w:ascii="Arial" w:hAnsi="Arial" w:eastAsia="Arial" w:cs="Arial"/>
+                <w:b w:val="0"/>
+                <w:i w:val="0"/>
+                <w:sz w:val="18"/>
+              </w:rPr>
+              <w:t>Nolkan y dan z pada Placement Position; ukur ulang</w:t>
+            </w:r>
+          </w:p>
+        </w:tc>
+      </w:tr>
+      <w:tr>
+        <w:tc>
+          <w:tcPr>
+            <w:tcW w:type="dxa" w:w="2929"/>
+          </w:tcPr>
+          <w:p>
+            <w:pPr>
+              <w:spacing w:after="0"/>
+            </w:pPr>
+            <w:r>
+              <w:rPr>
+                <w:rFonts w:ascii="Arial" w:hAnsi="Arial" w:eastAsia="Arial" w:cs="Arial"/>
+                <w:b w:val="0"/>
+                <w:i w:val="0"/>
+                <w:sz w:val="18"/>
+              </w:rPr>
+              <w:t>Std Measure Distance memberi 0 padahal tampak ada celah</w:t>
+            </w:r>
+          </w:p>
+        </w:tc>
+        <w:tc>
+          <w:tcPr>
+            <w:tcW w:type="dxa" w:w="2929"/>
+          </w:tcPr>
+          <w:p>
+            <w:pPr>
+              <w:spacing w:after="0"/>
+            </w:pPr>
+            <w:r>
+              <w:rPr>
+                <w:rFonts w:ascii="Arial" w:hAnsi="Arial" w:eastAsia="Arial" w:cs="Arial"/>
+                <w:b w:val="0"/>
+                <w:i w:val="0"/>
+                <w:sz w:val="18"/>
+              </w:rPr>
+              <w:t>Yang terpilih muka yang bersinggungan, bukan pasangan muka yang dimaksud</w:t>
+            </w:r>
+          </w:p>
+        </w:tc>
+        <w:tc>
+          <w:tcPr>
+            <w:tcW w:type="dxa" w:w="2929"/>
+          </w:tcPr>
+          <w:p>
+            <w:pPr>
+              <w:spacing w:after="0"/>
+            </w:pPr>
+            <w:r>
+              <w:rPr>
+                <w:rFonts w:ascii="Arial" w:hAnsi="Arial" w:eastAsia="Arial" w:cs="Arial"/>
+                <w:b w:val="0"/>
+                <w:i w:val="0"/>
+                <w:sz w:val="18"/>
+              </w:rPr>
+              <w:t>Perbesar tampilan, pilih muka lewat pohon atau tekan Space untuk menyembunyikan komponen penghalang</w:t>
+            </w:r>
+          </w:p>
+        </w:tc>
+      </w:tr>
+      <w:tr>
+        <w:tc>
+          <w:tcPr>
+            <w:tcW w:type="dxa" w:w="2929"/>
+          </w:tcPr>
+          <w:p>
+            <w:pPr>
+              <w:spacing w:after="0"/>
+            </w:pPr>
+            <w:r>
+              <w:rPr>
+                <w:rFonts w:ascii="Arial" w:hAnsi="Arial" w:eastAsia="Arial" w:cs="Arial"/>
+                <w:b w:val="0"/>
+                <w:i w:val="0"/>
+                <w:sz w:val="18"/>
+              </w:rPr>
+              <w:t>Kelonggaran terbaca setengah dari perkiraan</w:t>
+            </w:r>
+          </w:p>
+        </w:tc>
+        <w:tc>
+          <w:tcPr>
+            <w:tcW w:type="dxa" w:w="2929"/>
+          </w:tcPr>
+          <w:p>
+            <w:pPr>
+              <w:spacing w:after="0"/>
+            </w:pPr>
+            <w:r>
+              <w:rPr>
+                <w:rFonts w:ascii="Arial" w:hAnsi="Arial" w:eastAsia="Arial" w:cs="Arial"/>
+                <w:b w:val="0"/>
+                <w:i w:val="0"/>
+                <w:sz w:val="18"/>
+              </w:rPr>
+              <w:t>Yang diukur celah radial, sedangkan yang diminta kelonggaran diametral</w:t>
+            </w:r>
+          </w:p>
+        </w:tc>
+        <w:tc>
+          <w:tcPr>
+            <w:tcW w:type="dxa" w:w="2929"/>
+          </w:tcPr>
+          <w:p>
+            <w:pPr>
+              <w:spacing w:after="0"/>
+            </w:pPr>
+            <w:r>
+              <w:rPr>
+                <w:rFonts w:ascii="Arial" w:hAnsi="Arial" w:eastAsia="Arial" w:cs="Arial"/>
+                <w:b w:val="0"/>
+                <w:i w:val="0"/>
+                <w:sz w:val="18"/>
+              </w:rPr>
+              <w:t>Kalikan dua: c</w:t>
+            </w:r>
+            <w:r>
+              <w:rPr>
+                <w:rFonts w:ascii="Arial" w:hAnsi="Arial" w:eastAsia="Arial" w:cs="Arial"/>
+                <w:b w:val="0"/>
+                <w:i w:val="0"/>
+                <w:sz w:val="18"/>
+                <w:vertAlign w:val="subscript"/>
+              </w:rPr>
+              <w:t>diametral</w:t>
+            </w:r>
+            <w:r>
+              <w:rPr>
+                <w:rFonts w:ascii="Arial" w:hAnsi="Arial" w:eastAsia="Arial" w:cs="Arial"/>
+                <w:b w:val="0"/>
+                <w:i w:val="0"/>
+                <w:sz w:val="18"/>
+              </w:rPr>
+              <w:t xml:space="preserve"> = 2 × celah radial</w:t>
+            </w:r>
+          </w:p>
+        </w:tc>
+      </w:tr>
+      <w:tr>
+        <w:tc>
+          <w:tcPr>
+            <w:tcW w:type="dxa" w:w="2929"/>
+          </w:tcPr>
+          <w:p>
+            <w:pPr>
+              <w:spacing w:after="0"/>
+            </w:pPr>
+            <w:r>
+              <w:rPr>
+                <w:rFonts w:ascii="Arial" w:hAnsi="Arial" w:eastAsia="Arial" w:cs="Arial"/>
+                <w:b w:val="0"/>
+                <w:i w:val="0"/>
+                <w:sz w:val="18"/>
+              </w:rPr>
               <w:t>Pocket tidak berpusat sehingga dinding tidak sama tebal</w:t>
             </w:r>
           </w:p>
@@ -14464,7 +14867,7 @@
                 <w:i w:val="0"/>
                 <w:sz w:val="18"/>
               </w:rPr>
-              <w:t>Pakai konstrain Symmetric terhadap sumbu sketsa, atau beri jarak w dari keempat tepi</w:t>
+              <w:t>Pakai Centered Rectangle berpusat 0, 0 (konstrain Symmetric terpasang otomatis), atau beri jarak w dari keempat tepi</w:t>
             </w:r>
           </w:p>
         </w:tc>

</xml_diff>

<commit_message>
feat(cad): video Modul 12 versi klik GUI + teks praktik dan Gambar 7 sesuai rekaman (#1051)
Video praktik terbimbing Modul 12 (audit satu dokumen, 17:10) direkam dengan klik
GUI asli: Number of decimals 3, Cube A/B dan Intersection 3.150 → 0 mm³ (distToShape
0), fit ⌀12 H7/g6 ekstrem lewat Clarify Selection + Tools → Measure (17,500 µm,
c maks 0,035), rumah dengan Centered Rectangle (dinding 4, dasar 10, 79.680 mm³),
Slot dan Pocket Through all (e = 19), lengan pada θ* = 9,7275° (jarak bebas 28,979),
Check Geometry 0 invalid, Ctrl+S.

Teks Bagian 09 Modul 12 mengikuti rekaman (nilai tiap langkah, Measure disimpan,
isian ketiga Slot = jari-jari, Horizontal Constraint lewat daftar Elements, "Bad base
feature"); tabel gejala bertambah lima baris. Gambar 7: cincin dari bidang XY sejajar
pangkal poros, Pocket berpusat, dinding Cube 10 × 100 × 20, hasil Check Geometry.
Word/PDF Modul 12 dan PDF gabungan CAD dibangun ulang.

Co-authored-by: Claude Opus 5.5 <noreply@anthropic.com>
</commit_message>
<xml_diff>
--- a/Pemodelan-Computer-Aided-Design/Modul-Word/Modul-12-Identifikasi-Masalah-Desain-dan-Solusi-Optimasi.docx
+++ b/Pemodelan-Computer-Aided-Design/Modul-Word/Modul-12-Identifikasi-Masalah-Desain-dan-Solusi-Optimasi.docx
@@ -13774,7 +13774,7 @@
           <w:i w:val="0"/>
           <w:sz w:val="20"/>
         </w:rPr>
-        <w:t>Gambar 7 — Gambar kerja audit satu dokumen: tabrakan, fit, dinding tipis, jarak tepi, dan jarak bebas gerak. Satuan mm; volume dalam mm³. Nomor 1–5 mengikuti langkah: (1) Box A 60 × 45 × 28 dan Box B 50 × 45 × 28 menumpang δ = 2,5 sehingga Common = 3.150,00 mm³, lalu nol setelah B digeser ke ujung A; (2) cincin berlubang ⌀12,0180 (batas maksimum ⌀12 H7) dan poros ⌀11,9830 (batas minimum g6) sesumbu, celahnya digambar diperbesar; (3) rumah 80 × 60 × 40 dengan Pocket 72 × 52 sedalam 30; (4) pelat 120 × 50 × 6 dengan slot berjarak pusat 64 dan lebar 18, serta jarak tepi e; (5) lengan 70 × 24 × 8 diputar θ</w:t>
+        <w:t>Gambar 7 — Gambar kerja audit satu dokumen: tabrakan, fit, dinding tipis, jarak tepi, dan jarak bebas gerak. Satuan mm; volume dalam mm³. Nomor 1–5 mengikuti langkah: (1) Box A 60 × 45 × 28 dan Box B 50 × 45 × 28 menumpang δ = 2,5 sehingga Common = 3.150,00 mm³, lalu nol setelah B digeser ke ujung A; (2) cincin berlubang ⌀12,0180 (batas maksimum ⌀12 H7) dan poros ⌀11,9830 (batas minimum g6) sesumbu dari bidang XY, celahnya digambar diperbesar (diameter luar cincin 24 tidak memengaruhi fit); (3) rumah 80 × 60 × 40 dengan Pocket 72 × 52 sedalam 30; (4) pelat 120 × 50 × 6 dengan slot berjarak pusat 64 dan lebar 18, serta jarak tepi e; (5) lengan 70 × 24 × 8 diputar θ</w:t>
       </w:r>
       <w:r>
         <w:rPr>
@@ -13793,7 +13793,7 @@
           <w:i w:val="0"/>
           <w:sz w:val="20"/>
         </w:rPr>
-        <w:t xml:space="preserve"> = 9,73° di depan dinding pada x = 100. Diameter luar dan letak aksial cincin, serta ukuran Part Box dinding, tidak ditetapkan langkah, jadi digambar tanpa ukuran.</w:t>
+        <w:t xml:space="preserve"> = 9,73° di depan dinding (Cube 10 × 100 × 20) yang muka dalamnya pada x = 100. Setiap jarak diukur dengan Tools → Measure pada 3 desimal dan tersimpan sebagai objek Distance di grup Measurements.</w:t>
       </w:r>
     </w:p>
     <w:p>
@@ -13826,7 +13826,25 @@
           <w:i w:val="0"/>
           <w:sz w:val="22"/>
         </w:rPr>
-        <w:t>Buat dokumen baru. Part → Primitives → Box A berukuran 60 × 45 × 28 mm di titik asal, lalu Box B berukuran 50 × 45 × 28 mm dengan Placement Position x = 57,5 mm sehingga B menumpang A sejauh δ = 2,5 mm.</w:t>
+        <w:t xml:space="preserve">Buat dokumen baru. Edit → Preferences → General: </w:t>
+      </w:r>
+      <w:r>
+        <w:rPr>
+          <w:rFonts w:ascii="Arial" w:hAnsi="Arial" w:eastAsia="Arial" w:cs="Arial"/>
+          <w:b w:val="0"/>
+          <w:i/>
+          <w:sz w:val="22"/>
+        </w:rPr>
+        <w:t>Number of decimals</w:t>
+      </w:r>
+      <w:r>
+        <w:rPr>
+          <w:rFonts w:ascii="Arial" w:hAnsi="Arial" w:eastAsia="Arial" w:cs="Arial"/>
+          <w:b w:val="0"/>
+          <w:i w:val="0"/>
+          <w:sz w:val="22"/>
+        </w:rPr>
+        <w:t xml:space="preserve"> = 3 → OK, agar ukuran batas dan celah terbaca utuh. Workbench Part: Part → Primitives → Cube, F2 ganti nama “A”, tab Data: Length 60, Width 45, Height 28. Cube kedua “B”: 50 × 45 × 28, Placement → Position → x = 57,5 (ketik koma), sehingga B menumpang A sejauh δ = 2,5 mm.</w:t>
       </w:r>
     </w:p>
     <w:p>
@@ -13859,7 +13877,7 @@
           <w:i w:val="0"/>
           <w:sz w:val="22"/>
         </w:rPr>
-        <w:t>Pilih A dan B → Part → Boolean → Common. Baca Common.Shape.Volume (atau Std Measure Volume): 3.150,00 mm³, sama dengan δ·b·h. Catat sebagai nilai “sebelum”, lalu batalkan Boolean dengan Ctrl+Z.</w:t>
+        <w:t>Pilih A lalu Ctrl+klik B → Part → Boolean → Intersection. Konsol: round(App.ActiveDocument.Common.Shape.Volume, 2) = 3.150,00 mm³, sama dengan δ·b·h. Catat sebagai nilai “sebelum”, lalu klik ruang kosong dan Ctrl+Z untuk membatalkan Common.</w:t>
       </w:r>
     </w:p>
     <w:p>
@@ -13892,7 +13910,7 @@
           <w:i w:val="0"/>
           <w:sz w:val="22"/>
         </w:rPr>
-        <w:t>Ubah Placement Position x milik B menjadi tepat di ujung A sehingga keduanya hanya bersinggungan. Ulangi Common: volumenya harus 0 mm³, dan A.distToShape(B)[0] bernilai 0 karena bersentuhan. Beri jarak rakit kecil bila memang diinginkan celah.</w:t>
+        <w:t>Pilih B, Position x = 60 (tepat di ujung A). Ulangi Intersection: volume Common 0 mm³; konsol A, B = [App.ActiveDocument.getObjectsByLabel(n)[0].Shape for n in ('A', 'B')] lalu A.distToShape(B)[0] = 0 karena bersentuhan. Ctrl+Z, sembunyikan A dan B (Space), lalu klik ruang kosong: New Body yang dijalankan saat objek masih terpilih ditolak (“Bad base feature”).</w:t>
       </w:r>
     </w:p>
     <w:p>
@@ -13925,7 +13943,25 @@
           <w:i w:val="0"/>
           <w:sz w:val="22"/>
         </w:rPr>
-        <w:t>Body baru: cincin (Sketch dua lingkaran sepusat, lubang pada ukuran maksimum ⌀12,0180) di-Pad 10 mm, dan poros pada ukuran minimum ⌀11,9830 di-Pad 30 mm, sesumbu. Std Measure Distance antara dua muka silinder memberi celah radial 0,0175 mm; kalikan dua menjadi c</w:t>
+        <w:t xml:space="preserve">Part Design → New Body “Cincin”: Sketch XY-plane, Circle From Center pusat 0, 0 diameter 24, lalu lingkaran kedua diameter 12,018 (ukuran maksimum lubang) → Pad 10. New Body “Poros”: lingkaran 0, 0 diameter 11,983 (ukuran minimum poros) → Pad 30. Muka lubang cincin tertutup poros: klik kanan di atasnya → Clarify Selection → Face → Pad (Face…), lalu Ctrl+klik muka poros di atas cincin → Tools → </w:t>
+      </w:r>
+      <w:r>
+        <w:rPr>
+          <w:rFonts w:ascii="Arial" w:hAnsi="Arial" w:eastAsia="Arial" w:cs="Arial"/>
+          <w:b/>
+          <w:i w:val="0"/>
+          <w:sz w:val="22"/>
+        </w:rPr>
+        <w:t>Measure</w:t>
+      </w:r>
+      <w:r>
+        <w:rPr>
+          <w:rFonts w:ascii="Arial" w:hAnsi="Arial" w:eastAsia="Arial" w:cs="Arial"/>
+          <w:b w:val="0"/>
+          <w:i w:val="0"/>
+          <w:sz w:val="22"/>
+        </w:rPr>
+        <w:t>: 17,500 µm = 0,0175 mm (celah radial) → Save → Close. c</w:t>
       </w:r>
       <w:r>
         <w:rPr>
@@ -13944,7 +13980,7 @@
           <w:i w:val="0"/>
           <w:sz w:val="22"/>
         </w:rPr>
-        <w:t xml:space="preserve"> = 0,0350 mm.</w:t>
+        <w:t xml:space="preserve"> = 2 × 0,0175 = 0,035 mm.</w:t>
       </w:r>
     </w:p>
     <w:p>
@@ -13977,7 +14013,25 @@
           <w:i w:val="0"/>
           <w:sz w:val="22"/>
         </w:rPr>
-        <w:t>Body baru: Sketch 80 × 60 mm → Pad 40 mm. Pada muka atas, Sketch 72 × 52 mm yang dipusatkan dengan konstrain Symmetric → Pocket Dimension 30 mm. Periksa tebal dinding 4,0 mm dan dasar 10,0 mm dengan Std Measure; volume solid harus 79.680,00 mm³.</w:t>
+        <w:t xml:space="preserve">New Body “Rumah”: Sketch XY, </w:t>
+      </w:r>
+      <w:r>
+        <w:rPr>
+          <w:rFonts w:ascii="Arial" w:hAnsi="Arial" w:eastAsia="Arial" w:cs="Arial"/>
+          <w:b/>
+          <w:i w:val="0"/>
+          <w:sz w:val="22"/>
+        </w:rPr>
+        <w:t>Centered Rectangle</w:t>
+      </w:r>
+      <w:r>
+        <w:rPr>
+          <w:rFonts w:ascii="Arial" w:hAnsi="Arial" w:eastAsia="Arial" w:cs="Arial"/>
+          <w:b w:val="0"/>
+          <w:i w:val="0"/>
+          <w:sz w:val="22"/>
+        </w:rPr>
+        <w:t xml:space="preserve"> pusat 0, 0 ukuran 80 × 60 → Pad 40. Klik muka atas → New Sketch → Centered Rectangle pusat 0, 0 ukuran 72 × 52 (pusat sama: dinding rata) → Pocket 30. Konsol: volume 79.680,00 mm³. Tekan 2, klik tepi atas luar lalu Ctrl+klik tepi atas dalam satu dinding → Measure 4,000 mm; klik lantai Pocket, tekan 5, Ctrl+klik muka bawah → Measure 10,000 mm.</w:t>
       </w:r>
     </w:p>
     <w:p>
@@ -14010,7 +14064,43 @@
           <w:i w:val="0"/>
           <w:sz w:val="22"/>
         </w:rPr>
-        <w:t>Body baru: pelat 120 × 50 × 6 mm simetris terhadap origin → Pad. Pada muka atas gambar satu slot obround (alat Slot) dengan jarak pusat-ke-pusat 64 mm dan lebar 18 mm → Pocket Through all. Std Measure dari ujung busur ke tepi pendek pelat memberi e = 19,000 mm, di atas batas 1,5·t = 9,0 mm.</w:t>
+        <w:t xml:space="preserve">New Body “Pelat”: Centered Rectangle 120 × 50 → Pad 6. Klik muka atas → New Sketch → </w:t>
+      </w:r>
+      <w:r>
+        <w:rPr>
+          <w:rFonts w:ascii="Arial" w:hAnsi="Arial" w:eastAsia="Arial" w:cs="Arial"/>
+          <w:b/>
+          <w:i w:val="0"/>
+          <w:sz w:val="22"/>
+        </w:rPr>
+        <w:t>Slot</w:t>
+      </w:r>
+      <w:r>
+        <w:rPr>
+          <w:rFonts w:ascii="Arial" w:hAnsi="Arial" w:eastAsia="Arial" w:cs="Arial"/>
+          <w:b w:val="0"/>
+          <w:i w:val="0"/>
+          <w:sz w:val="22"/>
+        </w:rPr>
+        <w:t xml:space="preserve">: titik awal −32, 0; panjang 64, sudut 0; isian ketiga adalah jari-jari, ketik 9 (lebar 18). Sudut 0 tidak menjadi konstrain: pilih garis slot di daftar Elements → Horizontal Constraint (Fully constrained) → Pocket </w:t>
+      </w:r>
+      <w:r>
+        <w:rPr>
+          <w:rFonts w:ascii="Arial" w:hAnsi="Arial" w:eastAsia="Arial" w:cs="Arial"/>
+          <w:b w:val="0"/>
+          <w:i/>
+          <w:sz w:val="22"/>
+        </w:rPr>
+        <w:t>Through all</w:t>
+      </w:r>
+      <w:r>
+        <w:rPr>
+          <w:rFonts w:ascii="Arial" w:hAnsi="Arial" w:eastAsia="Arial" w:cs="Arial"/>
+          <w:b w:val="0"/>
+          <w:i w:val="0"/>
+          <w:sz w:val="22"/>
+        </w:rPr>
+        <w:t>. Tekan 2, klik tepi busur ujung slot lalu Ctrl+klik tepi pendek pelat → Measure e = 19,000 mm, di atas batas 1,5·t = 9,0 mm.</w:t>
       </w:r>
     </w:p>
     <w:p>
@@ -14043,7 +14133,7 @@
           <w:i w:val="0"/>
           <w:sz w:val="22"/>
         </w:rPr>
-        <w:t>Body lengan 70 × 24 × 8 mm dengan sumbu putar Z di titik asal, dan dinding Part Box yang muka dalamnya di x = 100 mm. Putar Placement Angle ke θ</w:t>
+        <w:t>New Body “Lengan”: Rectangle sudut 0, −12 ukuran 70 × 24 → Pad 8 (sumbu putar Z di titik asal). Workbench Part: Cube “Dinding” 10 × 100 × 20 di Position x = 100, y = −50 (muka dalam di x = 100). Pilih Body Lengan → Placement → Angle = θ</w:t>
       </w:r>
       <w:r>
         <w:rPr>
@@ -14062,7 +14152,25 @@
           <w:i w:val="0"/>
           <w:sz w:val="22"/>
         </w:rPr>
-        <w:t xml:space="preserve"> = 9,73° lalu Std Measure Distance sudut lengan → muka dinding: 28,979 mm. Jalankan Part → Check Geometry pada semua Body (harus bersih), lalu Ctrl+S ke Latihan12_NIM.FCStd.</w:t>
+        <w:t xml:space="preserve"> = 9,7275° (= 9,73°). Tekan 2, klik sudut lengan terjauh (vertex), tekan 6, Ctrl+klik muka dalam dinding → Measure 28,979 mm. Pilih kedelapan solid → Part → </w:t>
+      </w:r>
+      <w:r>
+        <w:rPr>
+          <w:rFonts w:ascii="Arial" w:hAnsi="Arial" w:eastAsia="Arial" w:cs="Arial"/>
+          <w:b/>
+          <w:i w:val="0"/>
+          <w:sz w:val="22"/>
+        </w:rPr>
+        <w:t>Check Geometry</w:t>
+      </w:r>
+      <w:r>
+        <w:rPr>
+          <w:rFonts w:ascii="Arial" w:hAnsi="Arial" w:eastAsia="Arial" w:cs="Arial"/>
+          <w:b w:val="0"/>
+          <w:i w:val="0"/>
+          <w:sz w:val="22"/>
+        </w:rPr>
+        <w:t xml:space="preserve"> → Run check: 0 invalid shapes. Ctrl+S ke Latihan12_NIM.FCStd.</w:t>
       </w:r>
     </w:p>
     <w:p>
@@ -14171,7 +14279,7 @@
                 <w:i w:val="0"/>
                 <w:sz w:val="18"/>
               </w:rPr>
-              <w:t>Common menghasilkan objek kosong padahal jelas menumpang</w:t>
+              <w:t>New Body menolak dengan pesan “Bad base feature”</w:t>
             </w:r>
           </w:p>
         </w:tc>
@@ -14190,7 +14298,7 @@
                 <w:i w:val="0"/>
                 <w:sz w:val="18"/>
               </w:rPr>
-              <w:t>Yang dipilih objek induk yang sudah termakan Boolean sebelumnya, atau salah satu bukan solid</w:t>
+              <w:t>Masih ada objek terpilih saat New Body (dijadikan base feature)</w:t>
             </w:r>
           </w:p>
         </w:tc>
@@ -14209,7 +14317,7 @@
                 <w:i w:val="0"/>
                 <w:sz w:val="18"/>
               </w:rPr>
-              <w:t>Batalkan Boolean terdahulu; periksa Check Geometry kedua bentuk</w:t>
+              <w:t>Klik ruang kosong dulu, lalu Part Design → New Body</w:t>
             </w:r>
           </w:p>
         </w:tc>
@@ -14230,7 +14338,7 @@
                 <w:i w:val="0"/>
                 <w:sz w:val="18"/>
               </w:rPr>
-              <w:t>Volume Common jauh dari δ·b·h</w:t>
+              <w:t>Measure menampilkan 0,02 mm untuk celah 0,0175 mm</w:t>
             </w:r>
           </w:p>
         </w:tc>
@@ -14249,7 +14357,7 @@
                 <w:i w:val="0"/>
                 <w:sz w:val="18"/>
               </w:rPr>
-              <w:t>Placement B juga bergeser arah Y atau Z, sehingga penampang bersama mengecil</w:t>
+              <w:t>Tampilan bawaan 2 desimal</w:t>
             </w:r>
           </w:p>
         </w:tc>
@@ -14268,7 +14376,7 @@
                 <w:i w:val="0"/>
                 <w:sz w:val="18"/>
               </w:rPr>
-              <w:t>Nolkan y dan z pada Placement Position; ukur ulang</w:t>
+              <w:t>Edit → Preferences → General → Number of decimals = 3</w:t>
             </w:r>
           </w:p>
         </w:tc>
@@ -14289,7 +14397,7 @@
                 <w:i w:val="0"/>
                 <w:sz w:val="18"/>
               </w:rPr>
-              <w:t>Std Measure Distance memberi 0 padahal tampak ada celah</w:t>
+              <w:t>Muka lubang cincin tidak bisa diklik</w:t>
             </w:r>
           </w:p>
         </w:tc>
@@ -14308,7 +14416,7 @@
                 <w:i w:val="0"/>
                 <w:sz w:val="18"/>
               </w:rPr>
-              <w:t>Yang terpilih muka yang bersinggungan, bukan pasangan muka yang dimaksud</w:t>
+              <w:t>Tertutup muka poros yang lebih dekat ke kamera</w:t>
             </w:r>
           </w:p>
         </w:tc>
@@ -14327,7 +14435,7 @@
                 <w:i w:val="0"/>
                 <w:sz w:val="18"/>
               </w:rPr>
-              <w:t>Perbesar tampilan, pilih muka lewat pohon atau tekan Space untuk menyembunyikan komponen penghalang</w:t>
+              <w:t>Klik kanan → Clarify Selection → Face → Pad (Face…), lalu Ctrl+klik muka kedua</w:t>
             </w:r>
           </w:p>
         </w:tc>
@@ -14348,7 +14456,7 @@
                 <w:i w:val="0"/>
                 <w:sz w:val="18"/>
               </w:rPr>
-              <w:t>Kelonggaran terbaca setengah dari perkiraan</w:t>
+              <w:t>Sketsa slot tetap under-constrained</w:t>
             </w:r>
           </w:p>
         </w:tc>
@@ -14367,7 +14475,7 @@
                 <w:i w:val="0"/>
                 <w:sz w:val="18"/>
               </w:rPr>
-              <w:t>Yang diukur celah radial, sedangkan yang diminta kelonggaran diametral</w:t>
+              <w:t>Sudut 0° pada on-view parameters tidak menjadi konstrain</w:t>
             </w:r>
           </w:p>
         </w:tc>
@@ -14386,26 +14494,7 @@
                 <w:i w:val="0"/>
                 <w:sz w:val="18"/>
               </w:rPr>
-              <w:t>Kalikan dua: c</w:t>
-            </w:r>
-            <w:r>
-              <w:rPr>
-                <w:rFonts w:ascii="Arial" w:hAnsi="Arial" w:eastAsia="Arial" w:cs="Arial"/>
-                <w:b w:val="0"/>
-                <w:i w:val="0"/>
-                <w:sz w:val="18"/>
-                <w:vertAlign w:val="subscript"/>
-              </w:rPr>
-              <w:t>diametral</w:t>
-            </w:r>
-            <w:r>
-              <w:rPr>
-                <w:rFonts w:ascii="Arial" w:hAnsi="Arial" w:eastAsia="Arial" w:cs="Arial"/>
-                <w:b w:val="0"/>
-                <w:i w:val="0"/>
-                <w:sz w:val="18"/>
-              </w:rPr>
-              <w:t xml:space="preserve"> = 2 × celah radial</w:t>
+              <w:t>Pilih garis slot di daftar Elements → Horizontal Constraint</w:t>
             </w:r>
           </w:p>
         </w:tc>
@@ -14426,6 +14515,320 @@
                 <w:i w:val="0"/>
                 <w:sz w:val="18"/>
               </w:rPr>
+              <w:t>Slot dua kali lebih lebar</w:t>
+            </w:r>
+          </w:p>
+        </w:tc>
+        <w:tc>
+          <w:tcPr>
+            <w:tcW w:type="dxa" w:w="2929"/>
+          </w:tcPr>
+          <w:p>
+            <w:pPr>
+              <w:spacing w:after="0"/>
+            </w:pPr>
+            <w:r>
+              <w:rPr>
+                <w:rFonts w:ascii="Arial" w:hAnsi="Arial" w:eastAsia="Arial" w:cs="Arial"/>
+                <w:b w:val="0"/>
+                <w:i w:val="0"/>
+                <w:sz w:val="18"/>
+              </w:rPr>
+              <w:t>Isian ketiga alat Slot adalah jari-jari, bukan lebar</w:t>
+            </w:r>
+          </w:p>
+        </w:tc>
+        <w:tc>
+          <w:tcPr>
+            <w:tcW w:type="dxa" w:w="2929"/>
+          </w:tcPr>
+          <w:p>
+            <w:pPr>
+              <w:spacing w:after="0"/>
+            </w:pPr>
+            <w:r>
+              <w:rPr>
+                <w:rFonts w:ascii="Arial" w:hAnsi="Arial" w:eastAsia="Arial" w:cs="Arial"/>
+                <w:b w:val="0"/>
+                <w:i w:val="0"/>
+                <w:sz w:val="18"/>
+              </w:rPr>
+              <w:t>Ketik setengah lebar (9 untuk lebar 18)</w:t>
+            </w:r>
+          </w:p>
+        </w:tc>
+      </w:tr>
+      <w:tr>
+        <w:tc>
+          <w:tcPr>
+            <w:tcW w:type="dxa" w:w="2929"/>
+          </w:tcPr>
+          <w:p>
+            <w:pPr>
+              <w:spacing w:after="0"/>
+            </w:pPr>
+            <w:r>
+              <w:rPr>
+                <w:rFonts w:ascii="Arial" w:hAnsi="Arial" w:eastAsia="Arial" w:cs="Arial"/>
+                <w:b w:val="0"/>
+                <w:i w:val="0"/>
+                <w:sz w:val="18"/>
+              </w:rPr>
+              <w:t>Common menghasilkan objek kosong padahal jelas menumpang</w:t>
+            </w:r>
+          </w:p>
+        </w:tc>
+        <w:tc>
+          <w:tcPr>
+            <w:tcW w:type="dxa" w:w="2929"/>
+          </w:tcPr>
+          <w:p>
+            <w:pPr>
+              <w:spacing w:after="0"/>
+            </w:pPr>
+            <w:r>
+              <w:rPr>
+                <w:rFonts w:ascii="Arial" w:hAnsi="Arial" w:eastAsia="Arial" w:cs="Arial"/>
+                <w:b w:val="0"/>
+                <w:i w:val="0"/>
+                <w:sz w:val="18"/>
+              </w:rPr>
+              <w:t>Yang dipilih objek induk yang sudah termakan Boolean sebelumnya, atau salah satu bukan solid</w:t>
+            </w:r>
+          </w:p>
+        </w:tc>
+        <w:tc>
+          <w:tcPr>
+            <w:tcW w:type="dxa" w:w="2929"/>
+          </w:tcPr>
+          <w:p>
+            <w:pPr>
+              <w:spacing w:after="0"/>
+            </w:pPr>
+            <w:r>
+              <w:rPr>
+                <w:rFonts w:ascii="Arial" w:hAnsi="Arial" w:eastAsia="Arial" w:cs="Arial"/>
+                <w:b w:val="0"/>
+                <w:i w:val="0"/>
+                <w:sz w:val="18"/>
+              </w:rPr>
+              <w:t>Batalkan Boolean terdahulu; periksa Check Geometry kedua bentuk</w:t>
+            </w:r>
+          </w:p>
+        </w:tc>
+      </w:tr>
+      <w:tr>
+        <w:tc>
+          <w:tcPr>
+            <w:tcW w:type="dxa" w:w="2929"/>
+          </w:tcPr>
+          <w:p>
+            <w:pPr>
+              <w:spacing w:after="0"/>
+            </w:pPr>
+            <w:r>
+              <w:rPr>
+                <w:rFonts w:ascii="Arial" w:hAnsi="Arial" w:eastAsia="Arial" w:cs="Arial"/>
+                <w:b w:val="0"/>
+                <w:i w:val="0"/>
+                <w:sz w:val="18"/>
+              </w:rPr>
+              <w:t>Volume Common jauh dari δ·b·h</w:t>
+            </w:r>
+          </w:p>
+        </w:tc>
+        <w:tc>
+          <w:tcPr>
+            <w:tcW w:type="dxa" w:w="2929"/>
+          </w:tcPr>
+          <w:p>
+            <w:pPr>
+              <w:spacing w:after="0"/>
+            </w:pPr>
+            <w:r>
+              <w:rPr>
+                <w:rFonts w:ascii="Arial" w:hAnsi="Arial" w:eastAsia="Arial" w:cs="Arial"/>
+                <w:b w:val="0"/>
+                <w:i w:val="0"/>
+                <w:sz w:val="18"/>
+              </w:rPr>
+              <w:t>Placement B juga bergeser arah Y atau Z, sehingga penampang bersama mengecil</w:t>
+            </w:r>
+          </w:p>
+        </w:tc>
+        <w:tc>
+          <w:tcPr>
+            <w:tcW w:type="dxa" w:w="2929"/>
+          </w:tcPr>
+          <w:p>
+            <w:pPr>
+              <w:spacing w:after="0"/>
+            </w:pPr>
+            <w:r>
+              <w:rPr>
+                <w:rFonts w:ascii="Arial" w:hAnsi="Arial" w:eastAsia="Arial" w:cs="Arial"/>
+                <w:b w:val="0"/>
+                <w:i w:val="0"/>
+                <w:sz w:val="18"/>
+              </w:rPr>
+              <w:t>Nolkan y dan z pada Placement Position; ukur ulang</w:t>
+            </w:r>
+          </w:p>
+        </w:tc>
+      </w:tr>
+      <w:tr>
+        <w:tc>
+          <w:tcPr>
+            <w:tcW w:type="dxa" w:w="2929"/>
+          </w:tcPr>
+          <w:p>
+            <w:pPr>
+              <w:spacing w:after="0"/>
+            </w:pPr>
+            <w:r>
+              <w:rPr>
+                <w:rFonts w:ascii="Arial" w:hAnsi="Arial" w:eastAsia="Arial" w:cs="Arial"/>
+                <w:b w:val="0"/>
+                <w:i w:val="0"/>
+                <w:sz w:val="18"/>
+              </w:rPr>
+              <w:t>Std Measure Distance memberi 0 padahal tampak ada celah</w:t>
+            </w:r>
+          </w:p>
+        </w:tc>
+        <w:tc>
+          <w:tcPr>
+            <w:tcW w:type="dxa" w:w="2929"/>
+          </w:tcPr>
+          <w:p>
+            <w:pPr>
+              <w:spacing w:after="0"/>
+            </w:pPr>
+            <w:r>
+              <w:rPr>
+                <w:rFonts w:ascii="Arial" w:hAnsi="Arial" w:eastAsia="Arial" w:cs="Arial"/>
+                <w:b w:val="0"/>
+                <w:i w:val="0"/>
+                <w:sz w:val="18"/>
+              </w:rPr>
+              <w:t>Yang terpilih muka yang bersinggungan, bukan pasangan muka yang dimaksud</w:t>
+            </w:r>
+          </w:p>
+        </w:tc>
+        <w:tc>
+          <w:tcPr>
+            <w:tcW w:type="dxa" w:w="2929"/>
+          </w:tcPr>
+          <w:p>
+            <w:pPr>
+              <w:spacing w:after="0"/>
+            </w:pPr>
+            <w:r>
+              <w:rPr>
+                <w:rFonts w:ascii="Arial" w:hAnsi="Arial" w:eastAsia="Arial" w:cs="Arial"/>
+                <w:b w:val="0"/>
+                <w:i w:val="0"/>
+                <w:sz w:val="18"/>
+              </w:rPr>
+              <w:t>Perbesar tampilan, pilih muka lewat pohon atau tekan Space untuk menyembunyikan komponen penghalang</w:t>
+            </w:r>
+          </w:p>
+        </w:tc>
+      </w:tr>
+      <w:tr>
+        <w:tc>
+          <w:tcPr>
+            <w:tcW w:type="dxa" w:w="2929"/>
+          </w:tcPr>
+          <w:p>
+            <w:pPr>
+              <w:spacing w:after="0"/>
+            </w:pPr>
+            <w:r>
+              <w:rPr>
+                <w:rFonts w:ascii="Arial" w:hAnsi="Arial" w:eastAsia="Arial" w:cs="Arial"/>
+                <w:b w:val="0"/>
+                <w:i w:val="0"/>
+                <w:sz w:val="18"/>
+              </w:rPr>
+              <w:t>Kelonggaran terbaca setengah dari perkiraan</w:t>
+            </w:r>
+          </w:p>
+        </w:tc>
+        <w:tc>
+          <w:tcPr>
+            <w:tcW w:type="dxa" w:w="2929"/>
+          </w:tcPr>
+          <w:p>
+            <w:pPr>
+              <w:spacing w:after="0"/>
+            </w:pPr>
+            <w:r>
+              <w:rPr>
+                <w:rFonts w:ascii="Arial" w:hAnsi="Arial" w:eastAsia="Arial" w:cs="Arial"/>
+                <w:b w:val="0"/>
+                <w:i w:val="0"/>
+                <w:sz w:val="18"/>
+              </w:rPr>
+              <w:t>Yang diukur celah radial, sedangkan yang diminta kelonggaran diametral</w:t>
+            </w:r>
+          </w:p>
+        </w:tc>
+        <w:tc>
+          <w:tcPr>
+            <w:tcW w:type="dxa" w:w="2929"/>
+          </w:tcPr>
+          <w:p>
+            <w:pPr>
+              <w:spacing w:after="0"/>
+            </w:pPr>
+            <w:r>
+              <w:rPr>
+                <w:rFonts w:ascii="Arial" w:hAnsi="Arial" w:eastAsia="Arial" w:cs="Arial"/>
+                <w:b w:val="0"/>
+                <w:i w:val="0"/>
+                <w:sz w:val="18"/>
+              </w:rPr>
+              <w:t>Kalikan dua: c</w:t>
+            </w:r>
+            <w:r>
+              <w:rPr>
+                <w:rFonts w:ascii="Arial" w:hAnsi="Arial" w:eastAsia="Arial" w:cs="Arial"/>
+                <w:b w:val="0"/>
+                <w:i w:val="0"/>
+                <w:sz w:val="18"/>
+                <w:vertAlign w:val="subscript"/>
+              </w:rPr>
+              <w:t>diametral</w:t>
+            </w:r>
+            <w:r>
+              <w:rPr>
+                <w:rFonts w:ascii="Arial" w:hAnsi="Arial" w:eastAsia="Arial" w:cs="Arial"/>
+                <w:b w:val="0"/>
+                <w:i w:val="0"/>
+                <w:sz w:val="18"/>
+              </w:rPr>
+              <w:t xml:space="preserve"> = 2 × celah radial</w:t>
+            </w:r>
+          </w:p>
+        </w:tc>
+      </w:tr>
+      <w:tr>
+        <w:tc>
+          <w:tcPr>
+            <w:tcW w:type="dxa" w:w="2929"/>
+          </w:tcPr>
+          <w:p>
+            <w:pPr>
+              <w:spacing w:after="0"/>
+            </w:pPr>
+            <w:r>
+              <w:rPr>
+                <w:rFonts w:ascii="Arial" w:hAnsi="Arial" w:eastAsia="Arial" w:cs="Arial"/>
+                <w:b w:val="0"/>
+                <w:i w:val="0"/>
+                <w:sz w:val="18"/>
+              </w:rPr>
               <w:t>Pocket tidak berpusat sehingga dinding tidak sama tebal</w:t>
             </w:r>
           </w:p>
@@ -14464,7 +14867,7 @@
                 <w:i w:val="0"/>
                 <w:sz w:val="18"/>
               </w:rPr>
-              <w:t>Pakai konstrain Symmetric terhadap sumbu sketsa, atau beri jarak w dari keempat tepi</w:t>
+              <w:t>Pakai Centered Rectangle berpusat 0, 0 (konstrain Symmetric terpasang otomatis), atau beri jarak w dari keempat tepi</w:t>
             </w:r>
           </w:p>
         </w:tc>

</xml_diff>